<commit_message>
Add opsd_soh_summary.csv with residential profiles and metrics
</commit_message>
<xml_diff>
--- a/doc/TCC_Modelo_Estrutural_Formatado_v4.docx
+++ b/doc/TCC_Modelo_Estrutural_Formatado_v4.docx
@@ -4,9 +4,6 @@
   <w:body>
     <w:p>
       <w:pPr>
-        <w:spacing w:after="480"/>
-        <w:ind w:firstLine="0"/>
-        <w:jc w:val="center"/>
         <w:rPr>
           <w:lang w:val="pt-BR"/>
         </w:rPr>
@@ -321,7 +318,6 @@
         <w:rPr>
           <w:color w:val="000000"/>
         </w:rPr>
-        <w:lastRenderedPageBreak/>
         <w:t xml:space="preserve">Keywords: Photovoltaic systems. Batteries. Predictive maintenance. </w:t>
       </w:r>
       <w:r>
@@ -376,6 +372,7 @@
           <w:rFonts w:ascii="Arial" w:eastAsia="Arial" w:hAnsi="Arial"/>
           <w:lang w:val="pt-BR"/>
         </w:rPr>
+        <w:lastRenderedPageBreak/>
         <w:t>INTRODUÇÃO</w:t>
       </w:r>
     </w:p>
@@ -435,35 +432,190 @@
     </w:p>
     <w:p>
       <w:pPr>
-        <w:rPr>
-          <w:lang w:val="pt-BR"/>
-        </w:rPr>
-      </w:pPr>
+        <w:jc w:val="center"/>
+        <w:rPr>
+          <w:color w:val="FF0000"/>
+          <w:lang w:val="pt-BR"/>
+        </w:rPr>
+      </w:pPr>
+      <w:r>
+        <w:rPr>
+          <w:lang w:val="pt-BR"/>
+        </w:rPr>
+        <w:t xml:space="preserve">O objetivo geral deste trabalho é adaptar e avaliar um modelo preditivo baseado em aprendizado de máquina para estimar o estado de saúde e o fim da vida útil de baterias aplicadas a sistemas fotovoltaicos. Para alcançar esse propósito, </w:t>
+      </w:r>
       <w:r>
         <w:rPr>
           <w:lang w:val="pt-BR"/>
         </w:rPr>
         <w:lastRenderedPageBreak/>
-        <w:t>O objetivo geral deste trabalho é adaptar e avaliar um modelo preditivo baseado em aprendizado de máquina para estimar o estado de saúde e o fim da vida útil de baterias aplicadas a sistemas fotovoltaicos. Para alcançar esse propósito, propõe-se identificar fatores de degradação, definir variáveis de entrada, preparar a base de dados, comparar modelos de regressão e classificação e discutir a aplicabilidade da abordagem no contexto da manutenção preditiva (AITIO; HOWEY, 2021; LUQUE et al., 2025).</w:t>
+        <w:t>propõe-se identificar fatores de degradação, definir variáveis de entrada, preparar a base de dados, comparar modelos de regressão e classificação e discutir a aplicabilidade da abordagem no contexto da manutenção preditiva (AITIO; HOWEY, 2021; LUQUE et al., 2025).</w:t>
+      </w:r>
+      <w:r>
+        <w:rPr>
+          <w:lang w:val="pt-BR"/>
+        </w:rPr>
+        <w:br/>
+      </w:r>
+      <w:r>
+        <w:rPr>
+          <w:lang w:val="pt-BR"/>
+        </w:rPr>
+        <w:br/>
+      </w:r>
+      <w:r>
+        <w:rPr>
+          <w:lang w:val="pt-BR"/>
+        </w:rPr>
+        <w:br/>
+      </w:r>
+      <w:r>
+        <w:rPr>
+          <w:color w:val="FF0000"/>
+          <w:lang w:val="pt-BR"/>
+        </w:rPr>
+        <w:t xml:space="preserve">[figura 3.b da Ref.4] - (elaborar texto explicando a imagem do perfil de geração típico em dia ensolarado, associando a necessidade de baterias visto a crescente de instalações de geração </w:t>
+      </w:r>
+      <w:proofErr w:type="spellStart"/>
+      <w:r>
+        <w:rPr>
+          <w:color w:val="FF0000"/>
+          <w:lang w:val="pt-BR"/>
+        </w:rPr>
+        <w:t>distribuida</w:t>
+      </w:r>
+      <w:proofErr w:type="spellEnd"/>
+      <w:r>
+        <w:rPr>
+          <w:color w:val="FF0000"/>
+          <w:lang w:val="pt-BR"/>
+        </w:rPr>
+        <w:t xml:space="preserve"> fotovoltaica residencial, ocasionando </w:t>
+      </w:r>
+      <w:proofErr w:type="spellStart"/>
+      <w:r>
+        <w:rPr>
+          <w:color w:val="FF0000"/>
+          <w:lang w:val="pt-BR"/>
+        </w:rPr>
+        <w:t>constrained</w:t>
+      </w:r>
+      <w:proofErr w:type="spellEnd"/>
+      <w:r>
+        <w:rPr>
+          <w:color w:val="FF0000"/>
+          <w:lang w:val="pt-BR"/>
+        </w:rPr>
+        <w:t>-off)</w:t>
+      </w:r>
+      <w:r>
+        <w:rPr>
+          <w:color w:val="FF0000"/>
+          <w:lang w:val="pt-BR"/>
+        </w:rPr>
+        <w:br/>
+      </w:r>
+      <w:r>
+        <w:rPr>
+          <w:noProof/>
+          <w:color w:val="FF0000"/>
+          <w:lang w:val="pt-BR"/>
+        </w:rPr>
+        <w:drawing>
+          <wp:inline distT="0" distB="0" distL="0" distR="0" wp14:anchorId="6D108362" wp14:editId="577B31C1">
+            <wp:extent cx="2734285" cy="2676063"/>
+            <wp:effectExtent l="0" t="0" r="9525" b="0"/>
+            <wp:docPr id="1123154399" name="Imagem 3"/>
+            <wp:cNvGraphicFramePr>
+              <a:graphicFrameLocks xmlns:a="http://schemas.openxmlformats.org/drawingml/2006/main" noChangeAspect="1"/>
+            </wp:cNvGraphicFramePr>
+            <a:graphic xmlns:a="http://schemas.openxmlformats.org/drawingml/2006/main">
+              <a:graphicData uri="http://schemas.openxmlformats.org/drawingml/2006/picture">
+                <pic:pic xmlns:pic="http://schemas.openxmlformats.org/drawingml/2006/picture">
+                  <pic:nvPicPr>
+                    <pic:cNvPr id="0" name="Picture 2"/>
+                    <pic:cNvPicPr>
+                      <a:picLocks noChangeAspect="1" noChangeArrowheads="1"/>
+                    </pic:cNvPicPr>
+                  </pic:nvPicPr>
+                  <pic:blipFill>
+                    <a:blip r:embed="rId8">
+                      <a:extLst>
+                        <a:ext uri="{28A0092B-C50C-407E-A947-70E740481C1C}">
+                          <a14:useLocalDpi xmlns:a14="http://schemas.microsoft.com/office/drawing/2010/main" val="0"/>
+                        </a:ext>
+                      </a:extLst>
+                    </a:blip>
+                    <a:srcRect/>
+                    <a:stretch>
+                      <a:fillRect/>
+                    </a:stretch>
+                  </pic:blipFill>
+                  <pic:spPr bwMode="auto">
+                    <a:xfrm>
+                      <a:off x="0" y="0"/>
+                      <a:ext cx="2752110" cy="2693508"/>
+                    </a:xfrm>
+                    <a:prstGeom prst="rect">
+                      <a:avLst/>
+                    </a:prstGeom>
+                    <a:noFill/>
+                  </pic:spPr>
+                </pic:pic>
+              </a:graphicData>
+            </a:graphic>
+          </wp:inline>
+        </w:drawing>
       </w:r>
     </w:p>
     <w:p>
       <w:pPr>
-        <w:pStyle w:val="Ttulo1"/>
-        <w:rPr>
-          <w:lang w:val="pt-BR"/>
-        </w:rPr>
-      </w:pPr>
-      <w:r>
-        <w:rPr>
-          <w:rFonts w:ascii="Arial" w:eastAsia="Arial" w:hAnsi="Arial"/>
-          <w:lang w:val="pt-BR"/>
-        </w:rPr>
-        <w:t>FUNDAMENTAÇÃO TEÓRICA</w:t>
+        <w:rPr>
+          <w:color w:val="FF0000"/>
+          <w:lang w:val="pt-BR"/>
+        </w:rPr>
+      </w:pPr>
+      <w:r>
+        <w:rPr>
+          <w:color w:val="FF0000"/>
+          <w:lang w:val="pt-BR"/>
+        </w:rPr>
+        <w:t xml:space="preserve">(buscar fonte para comprovar informação sobre </w:t>
+      </w:r>
+      <w:proofErr w:type="spellStart"/>
+      <w:r>
+        <w:rPr>
+          <w:color w:val="FF0000"/>
+          <w:lang w:val="pt-BR"/>
+        </w:rPr>
+        <w:t>constrained</w:t>
+      </w:r>
+      <w:proofErr w:type="spellEnd"/>
+      <w:r>
+        <w:rPr>
+          <w:color w:val="FF0000"/>
+          <w:lang w:val="pt-BR"/>
+        </w:rPr>
+        <w:t>-off)</w:t>
       </w:r>
     </w:p>
     <w:p>
       <w:pPr>
+        <w:pStyle w:val="Ttulo1"/>
+        <w:rPr>
+          <w:lang w:val="pt-BR"/>
+        </w:rPr>
+      </w:pPr>
+      <w:r>
+        <w:rPr>
+          <w:rFonts w:ascii="Arial" w:eastAsia="Arial" w:hAnsi="Arial"/>
+          <w:lang w:val="pt-BR"/>
+        </w:rPr>
+        <w:t>FUNDAMENTAÇÃO TEÓRICA</w:t>
+      </w:r>
+    </w:p>
+    <w:p>
+      <w:pPr>
         <w:pStyle w:val="Ttulo2"/>
         <w:jc w:val="left"/>
         <w:rPr>
@@ -503,11 +655,79 @@
           <w:color w:val="000000"/>
           <w:lang w:val="pt-BR"/>
         </w:rPr>
-        <w:t>Em aplicações residenciais, comerciais e isoladas, o armazenamento por baterias pode contribuir para a continuidade do fornecimento e para a viabilidade econômica do sistema. Entretanto, sua contribuição depende diretamente da forma como a bateria é operada, uma vez que estratégias de carga e descarga, limites de estado de carga e condições ambientais influenciam sua degradação ao longo do tempo (LUQUE et al., 2025).</w:t>
+        <w:t xml:space="preserve">Em aplicações residenciais, comerciais e isoladas, o armazenamento por baterias pode contribuir para a continuidade do fornecimento e para a viabilidade econômica do sistema. Entretanto, sua contribuição depende diretamente da forma </w:t>
+      </w:r>
+      <w:r>
+        <w:rPr>
+          <w:color w:val="000000"/>
+          <w:lang w:val="pt-BR"/>
+        </w:rPr>
+        <w:lastRenderedPageBreak/>
+        <w:t>como a bateria é operada, uma vez que estratégias de carga e descarga, limites de estado de carga e condições ambientais influenciam sua degradação ao longo do tempo (LUQUE et al., 2025).</w:t>
+      </w:r>
+      <w:r>
+        <w:rPr>
+          <w:color w:val="000000"/>
+          <w:lang w:val="pt-BR"/>
+        </w:rPr>
+        <w:br/>
+      </w:r>
+      <w:r>
+        <w:rPr>
+          <w:color w:val="000000"/>
+          <w:lang w:val="pt-BR"/>
+        </w:rPr>
+        <w:br/>
       </w:r>
     </w:p>
     <w:p>
       <w:pPr>
+        <w:rPr>
+          <w:color w:val="FF0000"/>
+          <w:lang w:val="pt-BR"/>
+        </w:rPr>
+      </w:pPr>
+      <w:r>
+        <w:rPr>
+          <w:color w:val="FF0000"/>
+          <w:lang w:val="pt-BR"/>
+        </w:rPr>
+        <w:t xml:space="preserve">Adicionar seção na fundamentação teórica sobre </w:t>
+      </w:r>
+      <w:proofErr w:type="spellStart"/>
+      <w:r>
+        <w:rPr>
+          <w:color w:val="FF0000"/>
+          <w:lang w:val="pt-BR"/>
+        </w:rPr>
+        <w:t>constrained</w:t>
+      </w:r>
+      <w:proofErr w:type="spellEnd"/>
+      <w:r>
+        <w:rPr>
+          <w:color w:val="FF0000"/>
+          <w:lang w:val="pt-BR"/>
+        </w:rPr>
+        <w:t>-off</w:t>
+      </w:r>
+    </w:p>
+    <w:p>
+      <w:pPr>
+        <w:rPr>
+          <w:color w:val="FF0000"/>
+          <w:lang w:val="pt-BR"/>
+        </w:rPr>
+      </w:pPr>
+      <w:r>
+        <w:rPr>
+          <w:color w:val="FF0000"/>
+          <w:lang w:val="pt-BR"/>
+        </w:rPr>
+        <w:t>https://www.delfos.energy/pt/blog-posts/constrained-off</w:t>
+      </w:r>
+    </w:p>
+    <w:p>
+      <w:pPr>
         <w:pStyle w:val="Ttulo2"/>
         <w:jc w:val="left"/>
         <w:rPr>
@@ -547,15 +767,7 @@
           <w:color w:val="000000"/>
           <w:lang w:val="pt-BR"/>
         </w:rPr>
-        <w:t xml:space="preserve">Em sistemas fotovoltaicos residenciais e estacionários, as baterias de íon-lítio vêm ganhando destaque por apresentarem maior eficiência e maior densidade de energia quando comparadas a tecnologias tradicionais. Ainda assim, a degradação permanece como um aspecto crítico, pois a perda de capacidade afeta o retorno </w:t>
-      </w:r>
-      <w:r>
-        <w:rPr>
-          <w:color w:val="000000"/>
-          <w:lang w:val="pt-BR"/>
-        </w:rPr>
-        <w:lastRenderedPageBreak/>
-        <w:t>financeiro, a confiabilidade e o planejamento de substituição do sistema de armazenamento (LUQUE et al., 2025).</w:t>
+        <w:t>Em sistemas fotovoltaicos residenciais e estacionários, as baterias de íon-lítio vêm ganhando destaque por apresentarem maior eficiência e maior densidade de energia quando comparadas a tecnologias tradicionais. Ainda assim, a degradação permanece como um aspecto crítico, pois a perda de capacidade afeta o retorno financeiro, a confiabilidade e o planejamento de substituição do sistema de armazenamento (LUQUE et al., 2025).</w:t>
       </w:r>
     </w:p>
     <w:p>
@@ -599,7 +811,15 @@
           <w:color w:val="000000"/>
           <w:lang w:val="pt-BR"/>
         </w:rPr>
-        <w:t>O envelhecimento por ciclo está relacionado a fatores como número de ciclos equivalentes completos, profundidade de descarga, taxa de corrente e temperatura de operação. Dessa forma, uma bateria submetida a ciclos mais profundos, temperaturas elevadas ou correntes mais intensas tende a apresentar degradação mais acelerada, comprometendo sua capacidade de armazenamento e sua resistência interna ao longo do tempo (AITIO; HOWEY, 2021; LUQUE et al., 2025).</w:t>
+        <w:t xml:space="preserve">O envelhecimento por ciclo está relacionado a fatores como número de ciclos equivalentes completos, profundidade de descarga, taxa de corrente e temperatura de operação. Dessa forma, uma bateria submetida a ciclos mais profundos, temperaturas elevadas ou correntes mais intensas tende a apresentar degradação </w:t>
+      </w:r>
+      <w:r>
+        <w:rPr>
+          <w:color w:val="000000"/>
+          <w:lang w:val="pt-BR"/>
+        </w:rPr>
+        <w:lastRenderedPageBreak/>
+        <w:t>mais acelerada, comprometendo sua capacidade de armazenamento e sua resistência interna ao longo do tempo (AITIO; HOWEY, 2021; LUQUE et al., 2025).</w:t>
       </w:r>
     </w:p>
     <w:p>
@@ -801,15 +1021,7 @@
           <w:color w:val="000000"/>
           <w:lang w:val="pt-BR"/>
         </w:rPr>
-        <w:t xml:space="preserve">A manutenção preditiva busca antecipar falhas a partir do acompanhamento de dados operacionais e da identificação de tendências de degradação. Diferentemente da manutenção corretiva, que ocorre apenas após a falha, e da manutenção </w:t>
-      </w:r>
-      <w:r>
-        <w:rPr>
-          <w:color w:val="000000"/>
-          <w:lang w:val="pt-BR"/>
-        </w:rPr>
-        <w:lastRenderedPageBreak/>
-        <w:t>preventiva, que se baseia em intervalos previamente definidos, a abordagem preditiva utiliza evidências extraídas do próprio comportamento do equipamento (AITIO; HOWEY, 2021).</w:t>
+        <w:t>A manutenção preditiva busca antecipar falhas a partir do acompanhamento de dados operacionais e da identificação de tendências de degradação. Diferentemente da manutenção corretiva, que ocorre apenas após a falha, e da manutenção preventiva, que se baseia em intervalos previamente definidos, a abordagem preditiva utiliza evidências extraídas do próprio comportamento do equipamento (AITIO; HOWEY, 2021).</w:t>
       </w:r>
     </w:p>
     <w:p>
@@ -853,7 +1065,15 @@
           <w:color w:val="000000"/>
           <w:lang w:val="pt-BR"/>
         </w:rPr>
-        <w:t>O aprendizado de máquina é uma área da inteligência artificial voltada à construção de modelos capazes de aprender padrões a partir de dados. Em problemas supervisionados, os modelos são treinados com exemplos de entrada e saída, permitindo que novas entradas sejam associadas a uma estimativa ou classificação com base no padrão aprendido durante o treinamento (RUSSELL; NORVIG, 2020).</w:t>
+        <w:t xml:space="preserve">O aprendizado de máquina é uma área da inteligência artificial voltada à construção de modelos capazes de aprender padrões a partir de dados. Em problemas supervisionados, os modelos são treinados com exemplos de entrada e </w:t>
+      </w:r>
+      <w:r>
+        <w:rPr>
+          <w:color w:val="000000"/>
+          <w:lang w:val="pt-BR"/>
+        </w:rPr>
+        <w:lastRenderedPageBreak/>
+        <w:t>saída, permitindo que novas entradas sejam associadas a uma estimativa ou classificação com base no padrão aprendido durante o treinamento (RUSSELL; NORVIG, 2020).</w:t>
       </w:r>
     </w:p>
     <w:p>
@@ -1023,15 +1243,7 @@
           <w:color w:val="000000"/>
           <w:lang w:val="pt-BR"/>
         </w:rPr>
-        <w:t xml:space="preserve"> e redes neurais têm sido utilizados em estudos de previsão de saúde de baterias. Para este trabalho, a escolha inicial por modelos </w:t>
-      </w:r>
-      <w:r>
-        <w:rPr>
-          <w:color w:val="000000"/>
-          <w:lang w:val="pt-BR"/>
-        </w:rPr>
-        <w:lastRenderedPageBreak/>
-        <w:t>supervisionados de regressão e classificação permite equilibrar desempenho, simplicidade de implementação, geração de métricas e interpretação dos fatores que mais influenciam a degradação (BREIMAN, 2001; RASMUSSEN; WILLIAMS, 2006; LUQUE et al., 2025).</w:t>
+        <w:t xml:space="preserve"> e redes neurais têm sido utilizados em estudos de previsão de saúde de baterias. Para este trabalho, a escolha inicial por modelos supervisionados de regressão e classificação permite equilibrar desempenho, simplicidade de implementação, geração de métricas e interpretação dos fatores que mais influenciam a degradação (BREIMAN, 2001; RASMUSSEN; WILLIAMS, 2006; LUQUE et al., 2025).</w:t>
       </w:r>
     </w:p>
     <w:p>
@@ -1073,6 +1285,7 @@
         <w:rPr>
           <w:lang w:val="pt-BR"/>
         </w:rPr>
+        <w:lastRenderedPageBreak/>
         <w:t>As variáveis diárias utilizadas no modelo são derivadas do perfil de potência residual: a média diária da potência residual (T1) e a média do valor absoluto da potência residual (T4). Esses atributos resumem o comportamento diário de carga e descarga e são combinados com o SOH inicial, a estratégia operacional e o índice de dia para estimar a perda de capacidade. A abordagem segue a metodologia de aprendizado de máquina descrita por Luque et al. (2025), com foco em manutenção preditiva e análise da degradação.</w:t>
       </w:r>
     </w:p>
@@ -1141,15 +1354,7 @@
           <w:color w:val="000000"/>
           <w:lang w:val="pt-BR"/>
         </w:rPr>
-        <w:t xml:space="preserve">O pré-processamento dos dados contemplará a verificação de valores ausentes, a remoção ou tratamento de outliers, a normalização das variáveis quando </w:t>
-      </w:r>
-      <w:r>
-        <w:rPr>
-          <w:color w:val="000000"/>
-          <w:lang w:val="pt-BR"/>
-        </w:rPr>
-        <w:lastRenderedPageBreak/>
-        <w:t>necessário, a criação de atributos derivados e a separação da base em conjuntos de treinamento e teste. Essa etapa é fundamental para reduzir distorções nos modelos e permitir uma avaliação mais consistente dos resultados obtidos (PEDREGOSA et al., 2011).</w:t>
+        <w:t>O pré-processamento dos dados contemplará a verificação de valores ausentes, a remoção ou tratamento de outliers, a normalização das variáveis quando necessário, a criação de atributos derivados e a separação da base em conjuntos de treinamento e teste. Essa etapa é fundamental para reduzir distorções nos modelos e permitir uma avaliação mais consistente dos resultados obtidos (PEDREGOSA et al., 2011).</w:t>
       </w:r>
     </w:p>
     <w:p>
@@ -1799,157 +2004,6 @@
                     <pic:cNvPicPr/>
                   </pic:nvPicPr>
                   <pic:blipFill>
-                    <a:blip r:embed="rId8"/>
-                    <a:stretch>
-                      <a:fillRect/>
-                    </a:stretch>
-                  </pic:blipFill>
-                  <pic:spPr>
-                    <a:xfrm>
-                      <a:off x="0" y="0"/>
-                      <a:ext cx="5029200" cy="2873829"/>
-                    </a:xfrm>
-                    <a:prstGeom prst="rect">
-                      <a:avLst/>
-                    </a:prstGeom>
-                  </pic:spPr>
-                </pic:pic>
-              </a:graphicData>
-            </a:graphic>
-          </wp:inline>
-        </w:drawing>
-      </w:r>
-    </w:p>
-    <w:p>
-      <w:pPr>
-        <w:rPr>
-          <w:lang w:val="pt-BR"/>
-        </w:rPr>
-      </w:pPr>
-      <w:r>
-        <w:rPr>
-          <w:lang w:val="pt-BR"/>
-        </w:rPr>
-        <w:t>Fonte: Elaborado pelos autores.</w:t>
-      </w:r>
-    </w:p>
-    <w:p>
-      <w:pPr>
-        <w:pStyle w:val="Ttulo1"/>
-        <w:rPr>
-          <w:lang w:val="pt-BR"/>
-        </w:rPr>
-      </w:pPr>
-      <w:r>
-        <w:rPr>
-          <w:rFonts w:ascii="Arial" w:eastAsia="Arial" w:hAnsi="Arial"/>
-          <w:lang w:val="pt-BR"/>
-        </w:rPr>
-        <w:t>RESULTADOS E DISCUSSÃO</w:t>
-      </w:r>
-    </w:p>
-    <w:p>
-      <w:pPr>
-        <w:rPr>
-          <w:lang w:val="pt-BR"/>
-        </w:rPr>
-      </w:pPr>
-      <w:r>
-        <w:rPr>
-          <w:color w:val="000000"/>
-          <w:lang w:val="pt-BR"/>
-        </w:rPr>
-        <w:t>A seção de resultados deverá apresentar inicialmente a análise exploratória dos dados, com a descrição das variáveis utilizadas e a identificação de padrões relacionados à degradação da bateria. Espera-se observar a redução gradual do SOH ao longo dos ciclos de operação, bem como a influência de variáveis como temperatura, resistência interna e profundidade de descarga sobre a perda de desempenho (AITIO; HOWEY, 2021; LUQUE et al., 2025).</w:t>
-      </w:r>
-    </w:p>
-    <w:p>
-      <w:pPr>
-        <w:rPr>
-          <w:lang w:val="pt-BR"/>
-        </w:rPr>
-      </w:pPr>
-      <w:r>
-        <w:rPr>
-          <w:lang w:val="pt-BR"/>
-        </w:rPr>
-        <w:lastRenderedPageBreak/>
-        <w:t>Resumo estatístico do SOH estimado: valor mínimo de 0.873256, valor máximo de 1.000000, média de 0.915486, desvio-padrão de 0.030566 e valor final de 0.873256.</w:t>
-      </w:r>
-    </w:p>
-    <w:p>
-      <w:pPr>
-        <w:rPr>
-          <w:lang w:val="pt-BR"/>
-        </w:rPr>
-      </w:pPr>
-      <w:r>
-        <w:rPr>
-          <w:lang w:val="pt-BR"/>
-        </w:rPr>
-        <w:t>Resumo estatístico do SOH estimado: valor mínimo de 0.873256, valor máximo de 1.000000, média de 0.915486, desvio-padrão de 0.030566 e valor final de 0.873256.</w:t>
-      </w:r>
-    </w:p>
-    <w:p>
-      <w:pPr>
-        <w:rPr>
-          <w:lang w:val="pt-BR"/>
-        </w:rPr>
-      </w:pPr>
-      <w:r>
-        <w:rPr>
-          <w:color w:val="000000"/>
-          <w:lang w:val="pt-BR"/>
-        </w:rPr>
-        <w:t>Na avaliação dos modelos de regressão, os resultados deverão ser discutidos a partir das métricas MAE, RMSE e R², permitindo comparar a proximidade entre o SOH previsto e o SOH de referência. O modelo com menor erro e maior capacidade de generalização deverá ser analisado de forma crítica, considerando não apenas o desempenho numérico, mas também sua aplicabilidade prática em um cenário de manutenção preditiva (PEDREGOSA et al., 2011; LUQUE et al., 2025).</w:t>
-      </w:r>
-    </w:p>
-    <w:p>
-      <w:pPr>
-        <w:rPr>
-          <w:lang w:val="pt-BR"/>
-        </w:rPr>
-      </w:pPr>
-      <w:r>
-        <w:rPr>
-          <w:color w:val="000000"/>
-          <w:lang w:val="pt-BR"/>
-        </w:rPr>
-        <w:t>Na avaliação dos modelos de classificação, deverão ser apresentadas métricas como acurácia, precisão, recall e F1-score, além da matriz de confusão. Essa análise permitirá verificar se o modelo é capaz de distinguir adequadamente baterias saudáveis daquelas em condição de atenção ou próximas ao fim de vida útil, aspecto essencial para reduzir atrasos na identificação de falhas (AITIO; HOWEY, 2021).</w:t>
-      </w:r>
-    </w:p>
-    <w:p>
-      <w:pPr>
-        <w:pStyle w:val="LegendaTCC"/>
-        <w:rPr>
-          <w:lang w:val="pt-BR"/>
-        </w:rPr>
-      </w:pPr>
-      <w:r>
-        <w:rPr>
-          <w:lang w:val="pt-BR"/>
-        </w:rPr>
-        <w:t>Gráfico 1 - SOH ao longo do tempo</w:t>
-      </w:r>
-      <w:r>
-        <w:rPr>
-          <w:noProof/>
-        </w:rPr>
-        <w:drawing>
-          <wp:inline distT="0" distB="0" distL="0" distR="0" wp14:anchorId="4C4C0138" wp14:editId="1AD7A0E1">
-            <wp:extent cx="5029200" cy="2873829"/>
-            <wp:effectExtent l="0" t="0" r="0" b="0"/>
-            <wp:docPr id="5" name="Picture 5"/>
-            <wp:cNvGraphicFramePr>
-              <a:graphicFrameLocks xmlns:a="http://schemas.openxmlformats.org/drawingml/2006/main" noChangeAspect="1"/>
-            </wp:cNvGraphicFramePr>
-            <a:graphic xmlns:a="http://schemas.openxmlformats.org/drawingml/2006/main">
-              <a:graphicData uri="http://schemas.openxmlformats.org/drawingml/2006/picture">
-                <pic:pic xmlns:pic="http://schemas.openxmlformats.org/drawingml/2006/picture">
-                  <pic:nvPicPr>
-                    <pic:cNvPr id="0" name="image.png"/>
-                    <pic:cNvPicPr/>
-                  </pic:nvPicPr>
-                  <pic:blipFill>
                     <a:blip r:embed="rId9"/>
                     <a:stretch>
                       <a:fillRect/>
@@ -1973,40 +2027,103 @@
     </w:p>
     <w:p>
       <w:pPr>
-        <w:pStyle w:val="LegendaTCC"/>
-        <w:spacing w:before="60" w:after="120"/>
-        <w:rPr>
-          <w:color w:val="000000"/>
-          <w:lang w:val="pt-BR"/>
-        </w:rPr>
-      </w:pPr>
-      <w:r>
-        <w:rPr>
-          <w:color w:val="000000"/>
-          <w:lang w:val="pt-BR"/>
-        </w:rPr>
-        <w:t>Fonte: Produzido pelos autores.</w:t>
+        <w:rPr>
+          <w:lang w:val="pt-BR"/>
+        </w:rPr>
+      </w:pPr>
+      <w:r>
+        <w:rPr>
+          <w:lang w:val="pt-BR"/>
+        </w:rPr>
+        <w:t>Fonte: Elaborado pelos autores.</w:t>
       </w:r>
     </w:p>
     <w:p>
       <w:pPr>
-        <w:pStyle w:val="LegendaTCC"/>
-        <w:spacing w:before="60" w:after="120"/>
-        <w:rPr>
-          <w:lang w:val="pt-BR"/>
-        </w:rPr>
-      </w:pPr>
+        <w:pStyle w:val="Ttulo1"/>
+        <w:rPr>
+          <w:lang w:val="pt-BR"/>
+        </w:rPr>
+      </w:pPr>
+      <w:r>
+        <w:rPr>
+          <w:rFonts w:ascii="Arial" w:eastAsia="Arial" w:hAnsi="Arial"/>
+          <w:lang w:val="pt-BR"/>
+        </w:rPr>
+        <w:t>RESULTADOS E DISCUSSÃO</w:t>
+      </w:r>
     </w:p>
     <w:p>
       <w:pPr>
-        <w:pStyle w:val="LegendaTCC"/>
-        <w:rPr>
-          <w:lang w:val="pt-BR"/>
-        </w:rPr>
-      </w:pPr>
+        <w:rPr>
+          <w:lang w:val="pt-BR"/>
+        </w:rPr>
+      </w:pPr>
+      <w:r>
+        <w:rPr>
+          <w:color w:val="000000"/>
+          <w:lang w:val="pt-BR"/>
+        </w:rPr>
+        <w:t>A seção de resultados deverá apresentar inicialmente a análise exploratória dos dados, com a descrição das variáveis utilizadas e a identificação de padrões relacionados à degradação da bateria. Espera-se observar a redução gradual do SOH ao longo dos ciclos de operação, bem como a influência de variáveis como temperatura, resistência interna e profundidade de descarga sobre a perda de desempenho (AITIO; HOWEY, 2021; LUQUE et al., 2025).</w:t>
+      </w:r>
     </w:p>
     <w:p>
       <w:pPr>
+        <w:rPr>
+          <w:lang w:val="pt-BR"/>
+        </w:rPr>
+      </w:pPr>
+      <w:r>
+        <w:rPr>
+          <w:lang w:val="pt-BR"/>
+        </w:rPr>
+        <w:lastRenderedPageBreak/>
+        <w:t>Resumo estatístico do SOH estimado: valor mínimo de 0.873256, valor máximo de 1.000000, média de 0.915486, desvio-padrão de 0.030566 e valor final de 0.873256.</w:t>
+      </w:r>
+    </w:p>
+    <w:p>
+      <w:pPr>
+        <w:rPr>
+          <w:lang w:val="pt-BR"/>
+        </w:rPr>
+      </w:pPr>
+      <w:r>
+        <w:rPr>
+          <w:lang w:val="pt-BR"/>
+        </w:rPr>
+        <w:t>Resumo estatístico do SOH estimado: valor mínimo de 0.873256, valor máximo de 1.000000, média de 0.915486, desvio-padrão de 0.030566 e valor final de 0.873256.</w:t>
+      </w:r>
+    </w:p>
+    <w:p>
+      <w:pPr>
+        <w:rPr>
+          <w:lang w:val="pt-BR"/>
+        </w:rPr>
+      </w:pPr>
+      <w:r>
+        <w:rPr>
+          <w:color w:val="000000"/>
+          <w:lang w:val="pt-BR"/>
+        </w:rPr>
+        <w:t>Na avaliação dos modelos de regressão, os resultados deverão ser discutidos a partir das métricas MAE, RMSE e R², permitindo comparar a proximidade entre o SOH previsto e o SOH de referência. O modelo com menor erro e maior capacidade de generalização deverá ser analisado de forma crítica, considerando não apenas o desempenho numérico, mas também sua aplicabilidade prática em um cenário de manutenção preditiva (PEDREGOSA et al., 2011; LUQUE et al., 2025).</w:t>
+      </w:r>
+    </w:p>
+    <w:p>
+      <w:pPr>
+        <w:rPr>
+          <w:lang w:val="pt-BR"/>
+        </w:rPr>
+      </w:pPr>
+      <w:r>
+        <w:rPr>
+          <w:color w:val="000000"/>
+          <w:lang w:val="pt-BR"/>
+        </w:rPr>
+        <w:t>Na avaliação dos modelos de classificação, deverão ser apresentadas métricas como acurácia, precisão, recall e F1-score, além da matriz de confusão. Essa análise permitirá verificar se o modelo é capaz de distinguir adequadamente baterias saudáveis daquelas em condição de atenção ou próximas ao fim de vida útil, aspecto essencial para reduzir atrasos na identificação de falhas (AITIO; HOWEY, 2021).</w:t>
+      </w:r>
+    </w:p>
+    <w:p>
+      <w:pPr>
         <w:pStyle w:val="LegendaTCC"/>
         <w:rPr>
           <w:lang w:val="pt-BR"/>
@@ -2016,18 +2133,17 @@
         <w:rPr>
           <w:lang w:val="pt-BR"/>
         </w:rPr>
-        <w:lastRenderedPageBreak/>
-        <w:t>Figura 2 - Matriz de correlação das variáveis</w:t>
+        <w:t>Gráfico 1 - SOH ao longo do tempo</w:t>
       </w:r>
       <w:r>
         <w:rPr>
           <w:noProof/>
         </w:rPr>
         <w:drawing>
-          <wp:inline distT="0" distB="0" distL="0" distR="0" wp14:anchorId="5D43A1EA" wp14:editId="06A78778">
-            <wp:extent cx="5029200" cy="4162097"/>
+          <wp:inline distT="0" distB="0" distL="0" distR="0" wp14:anchorId="4C4C0138" wp14:editId="1AD7A0E1">
+            <wp:extent cx="5029200" cy="2873829"/>
             <wp:effectExtent l="0" t="0" r="0" b="0"/>
-            <wp:docPr id="6" name="Picture 6"/>
+            <wp:docPr id="5" name="Picture 5"/>
             <wp:cNvGraphicFramePr>
               <a:graphicFrameLocks xmlns:a="http://schemas.openxmlformats.org/drawingml/2006/main" noChangeAspect="1"/>
             </wp:cNvGraphicFramePr>
@@ -2047,6 +2163,95 @@
                   <pic:spPr>
                     <a:xfrm>
                       <a:off x="0" y="0"/>
+                      <a:ext cx="5029200" cy="2873829"/>
+                    </a:xfrm>
+                    <a:prstGeom prst="rect">
+                      <a:avLst/>
+                    </a:prstGeom>
+                  </pic:spPr>
+                </pic:pic>
+              </a:graphicData>
+            </a:graphic>
+          </wp:inline>
+        </w:drawing>
+      </w:r>
+    </w:p>
+    <w:p>
+      <w:pPr>
+        <w:pStyle w:val="LegendaTCC"/>
+        <w:spacing w:before="60" w:after="120"/>
+        <w:rPr>
+          <w:color w:val="000000"/>
+          <w:lang w:val="pt-BR"/>
+        </w:rPr>
+      </w:pPr>
+      <w:r>
+        <w:rPr>
+          <w:color w:val="000000"/>
+          <w:lang w:val="pt-BR"/>
+        </w:rPr>
+        <w:t>Fonte: Produzido pelos autores.</w:t>
+      </w:r>
+    </w:p>
+    <w:p>
+      <w:pPr>
+        <w:pStyle w:val="LegendaTCC"/>
+        <w:spacing w:before="60" w:after="120"/>
+        <w:rPr>
+          <w:lang w:val="pt-BR"/>
+        </w:rPr>
+      </w:pPr>
+    </w:p>
+    <w:p>
+      <w:pPr>
+        <w:pStyle w:val="LegendaTCC"/>
+        <w:rPr>
+          <w:lang w:val="pt-BR"/>
+        </w:rPr>
+      </w:pPr>
+    </w:p>
+    <w:p>
+      <w:pPr>
+        <w:pStyle w:val="LegendaTCC"/>
+        <w:rPr>
+          <w:lang w:val="pt-BR"/>
+        </w:rPr>
+      </w:pPr>
+      <w:r>
+        <w:rPr>
+          <w:lang w:val="pt-BR"/>
+        </w:rPr>
+        <w:lastRenderedPageBreak/>
+        <w:t>Figura 2 - Matriz de correlação das variáveis</w:t>
+      </w:r>
+      <w:r>
+        <w:rPr>
+          <w:noProof/>
+        </w:rPr>
+        <w:drawing>
+          <wp:inline distT="0" distB="0" distL="0" distR="0" wp14:anchorId="5D43A1EA" wp14:editId="06A78778">
+            <wp:extent cx="5029200" cy="4162097"/>
+            <wp:effectExtent l="0" t="0" r="0" b="0"/>
+            <wp:docPr id="6" name="Picture 6"/>
+            <wp:cNvGraphicFramePr>
+              <a:graphicFrameLocks xmlns:a="http://schemas.openxmlformats.org/drawingml/2006/main" noChangeAspect="1"/>
+            </wp:cNvGraphicFramePr>
+            <a:graphic xmlns:a="http://schemas.openxmlformats.org/drawingml/2006/main">
+              <a:graphicData uri="http://schemas.openxmlformats.org/drawingml/2006/picture">
+                <pic:pic xmlns:pic="http://schemas.openxmlformats.org/drawingml/2006/picture">
+                  <pic:nvPicPr>
+                    <pic:cNvPr id="0" name="image.png"/>
+                    <pic:cNvPicPr/>
+                  </pic:nvPicPr>
+                  <pic:blipFill>
+                    <a:blip r:embed="rId11"/>
+                    <a:stretch>
+                      <a:fillRect/>
+                    </a:stretch>
+                  </pic:blipFill>
+                  <pic:spPr>
+                    <a:xfrm>
+                      <a:off x="0" y="0"/>
                       <a:ext cx="5029200" cy="4162097"/>
                     </a:xfrm>
                     <a:prstGeom prst="rect">
@@ -2509,7 +2714,7 @@
       </w:r>
     </w:p>
     <w:sectPr>
-      <w:headerReference w:type="default" r:id="rId11"/>
+      <w:headerReference w:type="default" r:id="rId12"/>
       <w:pgSz w:w="11906" w:h="16838"/>
       <w:pgMar w:top="1417" w:right="1417" w:bottom="1134" w:left="1417" w:header="709" w:footer="709" w:gutter="0"/>
       <w:cols w:space="720"/>

</xml_diff>